<commit_message>
Fixed the template layout issues
</commit_message>
<xml_diff>
--- a/InvoiceTemplate.docx
+++ b/InvoiceTemplate.docx
@@ -165,6 +165,134 @@
       </w:pPr>
       <w:r>
         <w:rPr>
+          <w:noProof/>
+          <w:spacing w:val="4"/>
+        </w:rPr>
+        <mc:AlternateContent>
+          <mc:Choice Requires="wps">
+            <w:drawing>
+              <wp:anchor distT="0" distB="0" distL="114300" distR="114300" simplePos="0" relativeHeight="251659264" behindDoc="0" locked="0" layoutInCell="1" allowOverlap="1" wp14:anchorId="2F61E0B4" wp14:editId="764EA37F">
+                <wp:simplePos x="0" y="0"/>
+                <wp:positionH relativeFrom="column">
+                  <wp:posOffset>3404235</wp:posOffset>
+                </wp:positionH>
+                <wp:positionV relativeFrom="paragraph">
+                  <wp:posOffset>100965</wp:posOffset>
+                </wp:positionV>
+                <wp:extent cx="1149350" cy="262255"/>
+                <wp:effectExtent l="0" t="0" r="0" b="0"/>
+                <wp:wrapNone/>
+                <wp:docPr id="344070381" name="Text Box 24"/>
+                <wp:cNvGraphicFramePr/>
+                <a:graphic xmlns:a="http://schemas.openxmlformats.org/drawingml/2006/main">
+                  <a:graphicData uri="http://schemas.microsoft.com/office/word/2010/wordprocessingShape">
+                    <wps:wsp>
+                      <wps:cNvSpPr txBox="1"/>
+                      <wps:spPr>
+                        <a:xfrm>
+                          <a:off x="0" y="0"/>
+                          <a:ext cx="1149350" cy="262255"/>
+                        </a:xfrm>
+                        <a:prstGeom prst="rect">
+                          <a:avLst/>
+                        </a:prstGeom>
+                        <a:noFill/>
+                        <a:ln>
+                          <a:noFill/>
+                        </a:ln>
+                      </wps:spPr>
+                      <wps:style>
+                        <a:lnRef idx="0">
+                          <a:scrgbClr r="0" g="0" b="0"/>
+                        </a:lnRef>
+                        <a:fillRef idx="0">
+                          <a:scrgbClr r="0" g="0" b="0"/>
+                        </a:fillRef>
+                        <a:effectRef idx="0">
+                          <a:scrgbClr r="0" g="0" b="0"/>
+                        </a:effectRef>
+                        <a:fontRef idx="minor">
+                          <a:schemeClr val="dk1"/>
+                        </a:fontRef>
+                      </wps:style>
+                      <wps:txbx>
+                        <w:txbxContent>
+                          <w:p>
+                            <w:pPr>
+                              <w:rPr>
+                                <w:sz w:val="18"/>
+                                <w:szCs w:val="18"/>
+                              </w:rPr>
+                            </w:pPr>
+                            <w:r>
+                              <w:rPr>
+                                <w:b/>
+                                <w:bCs/>
+                                <w:spacing w:val="4"/>
+                                <w:w w:val="105"/>
+                                <w:sz w:val="18"/>
+                                <w:szCs w:val="18"/>
+                              </w:rPr>
+                              <w:t>Customer</w:t>
+                            </w:r>
+                          </w:p>
+                        </w:txbxContent>
+                      </wps:txbx>
+                      <wps:bodyPr rot="0" spcFirstLastPara="0" vertOverflow="overflow" horzOverflow="overflow" vert="horz" wrap="square" lIns="91440" tIns="45720" rIns="91440" bIns="45720" numCol="1" spcCol="0" rtlCol="0" fromWordArt="0" anchor="t" anchorCtr="0" forceAA="0" compatLnSpc="1">
+                        <a:prstTxWarp prst="textNoShape">
+                          <a:avLst/>
+                        </a:prstTxWarp>
+                        <a:noAutofit/>
+                      </wps:bodyPr>
+                    </wps:wsp>
+                  </a:graphicData>
+                </a:graphic>
+                <wp14:sizeRelH relativeFrom="margin">
+                  <wp14:pctWidth>0</wp14:pctWidth>
+                </wp14:sizeRelH>
+                <wp14:sizeRelV relativeFrom="margin">
+                  <wp14:pctHeight>0</wp14:pctHeight>
+                </wp14:sizeRelV>
+              </wp:anchor>
+            </w:drawing>
+          </mc:Choice>
+          <mc:Fallback>
+            <w:pict>
+              <v:shapetype w14:anchorId="2F61E0B4" id="_x0000_t202" coordsize="21600,21600" o:spt="202" path="m,l,21600r21600,l21600,xe">
+                <v:stroke joinstyle="miter"/>
+                <v:path gradientshapeok="t" o:connecttype="rect"/>
+              </v:shapetype>
+              <v:shape id="Text Box 24" o:spid="_x0000_s1026" type="#_x0000_t202" style="position:absolute;left:0;text-align:left;margin-left:268.05pt;margin-top:7.95pt;width:90.5pt;height:20.65pt;z-index:251659264;visibility:visible;mso-wrap-style:square;mso-width-percent:0;mso-height-percent:0;mso-wrap-distance-left:9pt;mso-wrap-distance-top:0;mso-wrap-distance-right:9pt;mso-wrap-distance-bottom:0;mso-position-horizontal:absolute;mso-position-horizontal-relative:text;mso-position-vertical:absolute;mso-position-vertical-relative:text;mso-width-percent:0;mso-height-percent:0;mso-width-relative:margin;mso-height-relative:margin;v-text-anchor:top" o:gfxdata="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" filled="f" stroked="f">
+                <v:textbox>
+                  <w:txbxContent>
+                    <w:p>
+                      <w:pPr>
+                        <w:rPr>
+                          <w:sz w:val="18"/>
+                          <w:szCs w:val="18"/>
+                        </w:rPr>
+                      </w:pPr>
+                      <w:r>
+                        <w:rPr>
+                          <w:b/>
+                          <w:bCs/>
+                          <w:spacing w:val="4"/>
+                          <w:w w:val="105"/>
+                          <w:sz w:val="18"/>
+                          <w:szCs w:val="18"/>
+                        </w:rPr>
+                        <w:t>Customer</w:t>
+                      </w:r>
+                    </w:p>
+                  </w:txbxContent>
+                </v:textbox>
+              </v:shape>
+            </w:pict>
+          </mc:Fallback>
+        </mc:AlternateContent>
+      </w:r>
+      <w:r>
+        <w:rPr>
           <w:spacing w:val="17"/>
         </w:rPr>
         <w:t>{{Date}}</w:t>
@@ -230,7 +358,6 @@
           <w:w w:val="105"/>
         </w:rPr>
         <w:tab/>
-        <w:t xml:space="preserve">         </w:t>
       </w:r>
       <w:r>
         <w:rPr>
@@ -246,15 +373,6 @@
         </w:rPr>
         <w:tab/>
         <w:t xml:space="preserve">         </w:t>
-      </w:r>
-      <w:r>
-        <w:rPr>
-          <w:b/>
-          <w:bCs/>
-          <w:spacing w:val="4"/>
-          <w:w w:val="105"/>
-        </w:rPr>
-        <w:t>Customer</w:t>
       </w:r>
     </w:p>
     <w:p>
@@ -314,23 +432,7 @@
           <w:w w:val="105"/>
           <w:lang w:val="sv-SE"/>
         </w:rPr>
-        <w:t>{{CustomerAddressLine0</w:t>
-      </w:r>
-      <w:r>
-        <w:rPr>
-          <w:spacing w:val="4"/>
-          <w:w w:val="105"/>
-          <w:lang w:val="sv-SE"/>
-        </w:rPr>
-        <w:t>3</w:t>
-      </w:r>
-      <w:r>
-        <w:rPr>
-          <w:spacing w:val="4"/>
-          <w:w w:val="105"/>
-          <w:lang w:val="sv-SE"/>
-        </w:rPr>
-        <w:t>}}</w:t>
+        <w:t>{{CustomerAddressLine03}}</w:t>
       </w:r>
     </w:p>
     <w:bookmarkEnd w:id="0"/>
@@ -351,23 +453,7 @@
           <w:w w:val="105"/>
           <w:lang w:val="sv-SE"/>
         </w:rPr>
-        <w:t>{{CustomerAddressLine0</w:t>
-      </w:r>
-      <w:r>
-        <w:rPr>
-          <w:spacing w:val="4"/>
-          <w:w w:val="105"/>
-          <w:lang w:val="sv-SE"/>
-        </w:rPr>
-        <w:t>4</w:t>
-      </w:r>
-      <w:r>
-        <w:rPr>
-          <w:spacing w:val="4"/>
-          <w:w w:val="105"/>
-          <w:lang w:val="sv-SE"/>
-        </w:rPr>
-        <w:t>}}</w:t>
+        <w:t>{{CustomerAddressLine04}}</w:t>
       </w:r>
     </w:p>
     <w:bookmarkEnd w:id="1"/>
@@ -2120,58 +2206,21 @@
           <w:spacing w:val="7"/>
           <w:w w:val="105"/>
         </w:rPr>
-        <w:t xml:space="preserve">  </w:t>
-      </w:r>
-      <w:proofErr w:type="gramStart"/>
+        <w:t xml:space="preserve">    </w:t>
+      </w:r>
       <w:r>
         <w:rPr>
           <w:spacing w:val="7"/>
           <w:w w:val="105"/>
         </w:rPr>
-        <w:t xml:space="preserve">  </w:t>
+        <w:t xml:space="preserve"> </w:t>
       </w:r>
       <w:r>
         <w:rPr>
           <w:spacing w:val="7"/>
           <w:w w:val="105"/>
         </w:rPr>
-        <w:t xml:space="preserve"> </w:t>
-      </w:r>
-      <w:r>
-        <w:rPr>
-          <w:spacing w:val="7"/>
-          <w:w w:val="105"/>
-        </w:rPr>
-        <w:t>{</w:t>
-      </w:r>
-      <w:proofErr w:type="gramEnd"/>
-      <w:r>
-        <w:rPr>
-          <w:spacing w:val="7"/>
-          <w:w w:val="105"/>
-        </w:rPr>
-        <w:t>{Amount}}</w:t>
-      </w:r>
-      <w:r>
-        <w:rPr>
-          <w:spacing w:val="7"/>
-          <w:w w:val="105"/>
-        </w:rPr>
-        <w:t xml:space="preserve"> </w:t>
-      </w:r>
-      <w:r>
-        <w:rPr>
-          <w:spacing w:val="7"/>
-          <w:w w:val="105"/>
-        </w:rPr>
-        <w:t xml:space="preserve">Associate Consultant </w:t>
-      </w:r>
-      <w:r>
-        <w:rPr>
-          <w:spacing w:val="7"/>
-          <w:w w:val="105"/>
-        </w:rPr>
-        <w:t>–</w:t>
+        <w:t>{{Amount}}</w:t>
       </w:r>
       <w:r>
         <w:rPr>
@@ -4188,7 +4237,16 @@
           <w:w w:val="105"/>
         </w:rPr>
         <w:br/>
-        <w:t>Swift Code</w:t>
+        <w:t>Swift C</w:t>
+      </w:r>
+      <w:proofErr w:type="spellStart"/>
+      <w:r>
+        <w:rPr>
+          <w:color w:val="000000" w:themeColor="text1"/>
+          <w:spacing w:val="14"/>
+          <w:w w:val="105"/>
+        </w:rPr>
+        <w:t>ode</w:t>
       </w:r>
       <w:r>
         <w:rPr>
@@ -4204,25 +4262,16 @@
           <w:color w:val="111111"/>
           <w:shd w:val="clear" w:color="auto" w:fill="FFFFFF"/>
         </w:rPr>
-        <w:t>{{</w:t>
-      </w:r>
-      <w:proofErr w:type="spellStart"/>
+        <w:t>{{SwiftCo</w:t>
+      </w:r>
+      <w:proofErr w:type="spellEnd"/>
       <w:r>
         <w:rPr>
           <w:rFonts w:ascii="Nunito" w:hAnsi="Nunito"/>
           <w:color w:val="111111"/>
           <w:shd w:val="clear" w:color="auto" w:fill="FFFFFF"/>
         </w:rPr>
-        <w:t>SwiftCode</w:t>
-      </w:r>
-      <w:proofErr w:type="spellEnd"/>
-      <w:r>
-        <w:rPr>
-          <w:rFonts w:ascii="Nunito" w:hAnsi="Nunito"/>
-          <w:color w:val="111111"/>
-          <w:shd w:val="clear" w:color="auto" w:fill="FFFFFF"/>
-        </w:rPr>
-        <w:t>}}</w:t>
+        <w:t>de}}</w:t>
       </w:r>
     </w:p>
     <w:p>

</xml_diff>